<commit_message>
Add Node js application for Deploying and Using for testing of our devSecOps pipeline
</commit_message>
<xml_diff>
--- a/reports/Week1-2_Literature_Review_and_Tool_Selection.docx
+++ b/reports/Week1-2_Literature_Review_and_Tool_Selection.docx
@@ -779,9 +779,12 @@
           <w:sz w:val="28"/>
           <w:szCs w:val="28"/>
         </w:rPr>
-        <w:t>2.</w:t>
-      </w:r>
-      <w:r>
+        <w:t>2.5 Best Practices and Tool Integration</w:t>
+      </w:r>
+    </w:p>
+    <w:p>
+      <w:pPr>
+        <w:ind w:firstLine="720"/>
         <w:rPr>
           <w:rFonts w:ascii="Calibri" w:hAnsi="Calibri" w:cs="Calibri"/>
           <w:b/>
@@ -789,8 +792,7 @@
           <w:sz w:val="28"/>
           <w:szCs w:val="28"/>
         </w:rPr>
-        <w:t>5</w:t>
-      </w:r>
+      </w:pPr>
       <w:r>
         <w:rPr>
           <w:rFonts w:ascii="Calibri" w:hAnsi="Calibri" w:cs="Calibri"/>
@@ -799,49 +801,7 @@
           <w:sz w:val="28"/>
           <w:szCs w:val="28"/>
         </w:rPr>
-        <w:t xml:space="preserve"> Best Practices and Tool Integration</w:t>
-      </w:r>
-    </w:p>
-    <w:p>
-      <w:pPr>
-        <w:ind w:firstLine="720"/>
-        <w:rPr>
-          <w:rFonts w:ascii="Calibri" w:hAnsi="Calibri" w:cs="Calibri"/>
-          <w:b/>
-          <w:bCs/>
-          <w:sz w:val="28"/>
-          <w:szCs w:val="28"/>
-        </w:rPr>
-      </w:pPr>
-      <w:r>
-        <w:rPr>
-          <w:rFonts w:ascii="Calibri" w:hAnsi="Calibri" w:cs="Calibri"/>
-          <w:b/>
-          <w:bCs/>
-          <w:sz w:val="28"/>
-          <w:szCs w:val="28"/>
-        </w:rPr>
-        <w:t>2.</w:t>
-      </w:r>
-      <w:r>
-        <w:rPr>
-          <w:rFonts w:ascii="Calibri" w:hAnsi="Calibri" w:cs="Calibri"/>
-          <w:b/>
-          <w:bCs/>
-          <w:sz w:val="28"/>
-          <w:szCs w:val="28"/>
-        </w:rPr>
-        <w:t>6</w:t>
-      </w:r>
-      <w:r>
-        <w:rPr>
-          <w:rFonts w:ascii="Calibri" w:hAnsi="Calibri" w:cs="Calibri"/>
-          <w:b/>
-          <w:bCs/>
-          <w:sz w:val="28"/>
-          <w:szCs w:val="28"/>
-        </w:rPr>
-        <w:t xml:space="preserve"> Summary and Research Gap</w:t>
+        <w:t>2.6 Summary and Research Gap</w:t>
       </w:r>
     </w:p>
     <w:p>
@@ -1934,31 +1894,17 @@
         </w:rPr>
         <w:t xml:space="preserve">. The combination of CI/CD automation and DevSecOps practices reduces both deployment time and post-release vulnerabilities, enhancing </w:t>
       </w:r>
-      <w:proofErr w:type="spellStart"/>
-      <w:r>
-        <w:rPr>
-          <w:rFonts w:ascii="Calibri" w:hAnsi="Calibri" w:cs="Calibri"/>
-        </w:rPr>
-        <w:t>o</w:t>
-      </w:r>
-      <w:r>
-        <w:rPr>
-          <w:rFonts w:ascii="Calibri" w:hAnsi="Calibri" w:cs="Calibri"/>
-        </w:rPr>
-        <w:t>s</w:t>
-      </w:r>
-      <w:r>
-        <w:rPr>
-          <w:rFonts w:ascii="Calibri" w:hAnsi="Calibri" w:cs="Calibri"/>
-        </w:rPr>
-        <w:t>erall</w:t>
-      </w:r>
-      <w:proofErr w:type="spellEnd"/>
-      <w:r>
-        <w:rPr>
-          <w:rFonts w:ascii="Calibri" w:hAnsi="Calibri" w:cs="Calibri"/>
-        </w:rPr>
-        <w:t xml:space="preserve"> system resilience.</w:t>
+      <w:r>
+        <w:rPr>
+          <w:rFonts w:ascii="Calibri" w:hAnsi="Calibri" w:cs="Calibri"/>
+        </w:rPr>
+        <w:t xml:space="preserve">overall </w:t>
+      </w:r>
+      <w:r>
+        <w:rPr>
+          <w:rFonts w:ascii="Calibri" w:hAnsi="Calibri" w:cs="Calibri"/>
+        </w:rPr>
+        <w:t>system resilience.</w:t>
       </w:r>
     </w:p>
     <w:p>

</xml_diff>